<commit_message>
Actualizo práctica de empleabilidad y añado entrega de interfaces
</commit_message>
<xml_diff>
--- a/IP/Copia de PRÁCTICA Nº 1 ITINERARIO PARA LA EMPLEABILIDAD II.docx
+++ b/IP/Copia de PRÁCTICA Nº 1 ITINERARIO PARA LA EMPLEABILIDAD II.docx
@@ -1,6 +1,6 @@
 
 <file path=word/document.xml><?xml version="1.0" encoding="utf-8"?>
-<w:document xmlns:wpc="http://schemas.microsoft.com/office/word/2010/wordprocessingCanvas" xmlns:cx="http://schemas.microsoft.com/office/drawing/2014/chartex" xmlns:cx1="http://schemas.microsoft.com/office/drawing/2015/9/8/chartex" xmlns:cx2="http://schemas.microsoft.com/office/drawing/2015/10/21/chartex" xmlns:cx3="http://schemas.microsoft.com/office/drawing/2016/5/9/chartex" xmlns:cx4="http://schemas.microsoft.com/office/drawing/2016/5/10/chartex" xmlns:cx5="http://schemas.microsoft.com/office/drawing/2016/5/11/chartex" xmlns:cx6="http://schemas.microsoft.com/office/drawing/2016/5/12/chartex" xmlns:cx7="http://schemas.microsoft.com/office/drawing/2016/5/13/chartex" xmlns:cx8="http://schemas.microsoft.com/office/drawing/2016/5/14/chartex" xmlns:mc="http://schemas.openxmlformats.org/markup-compatibility/2006" xmlns:aink="http://schemas.microsoft.com/office/drawing/2016/ink" xmlns:am3d="http://schemas.microsoft.com/office/drawing/2017/model3d" xmlns:o="urn:schemas-microsoft-com:office:office" xmlns:oel="http://schemas.microsoft.com/office/2019/extlst" xmlns:r="http://schemas.openxmlformats.org/officeDocument/2006/relationships" xmlns:m="http://schemas.openxmlformats.org/officeDocument/2006/math" xmlns:v="urn:schemas-microsoft-com:vml" xmlns:wp14="http://schemas.microsoft.com/office/word/2010/wordprocessingDrawing" xmlns:wp="http://schemas.openxmlformats.org/drawingml/2006/wordprocessingDrawing" xmlns:w10="urn:schemas-microsoft-com:office:word" xmlns:w="http://schemas.openxmlformats.org/wordprocessingml/2006/main" xmlns:w14="http://schemas.microsoft.com/office/word/2010/wordml" xmlns:w15="http://schemas.microsoft.com/office/word/2012/wordml" xmlns:w16cex="http://schemas.microsoft.com/office/word/2018/wordml/cex" xmlns:w16cid="http://schemas.microsoft.com/office/word/2016/wordml/cid" xmlns:w16="http://schemas.microsoft.com/office/word/2018/wordml" xmlns:w16du="http://schemas.microsoft.com/office/word/2023/wordml/word16du" xmlns:w16sdtdh="http://schemas.microsoft.com/office/word/2020/wordml/sdtdatahash" xmlns:w16sdtfl="http://schemas.microsoft.com/office/word/2024/wordml/sdtformatlock" xmlns:w16se="http://schemas.microsoft.com/office/word/2015/wordml/symex" xmlns:wpg="http://schemas.microsoft.com/office/word/2010/wordprocessingGroup" xmlns:wpi="http://schemas.microsoft.com/office/word/2010/wordprocessingInk" xmlns:wne="http://schemas.microsoft.com/office/word/2006/wordml" xmlns:wps="http://schemas.microsoft.com/office/word/2010/wordprocessingShape" mc:Ignorable="w14 w15 w16se w16cid w16 w16cex w16sdtdh w16sdtfl w16du wp14">
+<w:document xmlns:wpc="http://schemas.microsoft.com/office/word/2010/wordprocessingCanvas" xmlns:cx="http://schemas.microsoft.com/office/drawing/2014/chartex" xmlns:cx1="http://schemas.microsoft.com/office/drawing/2015/9/8/chartex" xmlns:cx2="http://schemas.microsoft.com/office/drawing/2015/10/21/chartex" xmlns:cx3="http://schemas.microsoft.com/office/drawing/2016/5/9/chartex" xmlns:cx4="http://schemas.microsoft.com/office/drawing/2016/5/10/chartex" xmlns:cx5="http://schemas.microsoft.com/office/drawing/2016/5/11/chartex" xmlns:cx6="http://schemas.microsoft.com/office/drawing/2016/5/12/chartex" xmlns:cx7="http://schemas.microsoft.com/office/drawing/2016/5/13/chartex" xmlns:cx8="http://schemas.microsoft.com/office/drawing/2016/5/14/chartex" xmlns:mc="http://schemas.openxmlformats.org/markup-compatibility/2006" xmlns:aink="http://schemas.microsoft.com/office/drawing/2016/ink" xmlns:am3d="http://schemas.microsoft.com/office/drawing/2017/model3d" xmlns:o="urn:schemas-microsoft-com:office:office" xmlns:r="http://schemas.openxmlformats.org/officeDocument/2006/relationships" xmlns:m="http://schemas.openxmlformats.org/officeDocument/2006/math" xmlns:v="urn:schemas-microsoft-com:vml" xmlns:wp14="http://schemas.microsoft.com/office/word/2010/wordprocessingDrawing" xmlns:wp="http://schemas.openxmlformats.org/drawingml/2006/wordprocessingDrawing" xmlns:w10="urn:schemas-microsoft-com:office:word" xmlns:w="http://schemas.openxmlformats.org/wordprocessingml/2006/main" xmlns:w14="http://schemas.microsoft.com/office/word/2010/wordml" xmlns:w15="http://schemas.microsoft.com/office/word/2012/wordml" xmlns:w16cex="http://schemas.microsoft.com/office/word/2018/wordml/cex" xmlns:w16cid="http://schemas.microsoft.com/office/word/2016/wordml/cid" xmlns:w16="http://schemas.microsoft.com/office/word/2018/wordml" xmlns:w16sdtdh="http://schemas.microsoft.com/office/word/2020/wordml/sdtdatahash" xmlns:w16se="http://schemas.microsoft.com/office/word/2015/wordml/symex" xmlns:wpg="http://schemas.microsoft.com/office/word/2010/wordprocessingGroup" xmlns:wpi="http://schemas.microsoft.com/office/word/2010/wordprocessingInk" xmlns:wne="http://schemas.microsoft.com/office/word/2006/wordml" xmlns:wps="http://schemas.microsoft.com/office/word/2010/wordprocessingShape" mc:Ignorable="w14 w15 w16se w16cid w16 w16cex w16sdtdh wp14">
   <w:body>
     <w:p>
       <w:pPr>
@@ -211,16 +211,7 @@
                 <w:sz w:val="24"/>
                 <w:szCs w:val="24"/>
               </w:rPr>
-              <w:t xml:space="preserve"> </w:t>
-            </w:r>
-            <w:r>
-              <w:rPr>
-                <w:rFonts w:ascii="Times New Roman" w:hAnsi="Times New Roman" w:cs="Times New Roman"/>
-                <w:color w:val="000000" w:themeColor="text1"/>
-                <w:sz w:val="24"/>
-                <w:szCs w:val="24"/>
-              </w:rPr>
-              <w:t>Sandoval Laborde</w:t>
+              <w:t xml:space="preserve"> Sandoval Laborde</w:t>
             </w:r>
           </w:p>
         </w:tc>
@@ -409,25 +400,14 @@
         </w:rPr>
         <w:t xml:space="preserve"> </w:t>
       </w:r>
-      <w:proofErr w:type="gramStart"/>
-      <w:r>
-        <w:rPr>
-          <w:rFonts w:ascii="Times New Roman" w:hAnsi="Times New Roman" w:cs="Times New Roman"/>
-          <w:color w:val="000000"/>
-          <w:sz w:val="24"/>
-          <w:szCs w:val="24"/>
-        </w:rPr>
-        <w:t>Haz</w:t>
-      </w:r>
-      <w:proofErr w:type="gramEnd"/>
-      <w:r>
-        <w:rPr>
-          <w:rFonts w:ascii="Times New Roman" w:hAnsi="Times New Roman" w:cs="Times New Roman"/>
-          <w:color w:val="000000"/>
-          <w:sz w:val="24"/>
-          <w:szCs w:val="24"/>
-        </w:rPr>
-        <w:t xml:space="preserve"> una captura o guarda el enlace de cada oferta </w:t>
+      <w:r>
+        <w:rPr>
+          <w:rFonts w:ascii="Times New Roman" w:hAnsi="Times New Roman" w:cs="Times New Roman"/>
+          <w:color w:val="000000"/>
+          <w:sz w:val="24"/>
+          <w:szCs w:val="24"/>
+        </w:rPr>
+        <w:t xml:space="preserve">Haz una captura o guarda el enlace de cada oferta </w:t>
       </w:r>
       <w:proofErr w:type="gramStart"/>
       <w:r>
@@ -820,6 +800,15 @@
         </w:rPr>
         <w:t>:</w:t>
       </w:r>
+      <w:r>
+        <w:rPr>
+          <w:rFonts w:ascii="Times New Roman" w:hAnsi="Times New Roman" w:cs="Times New Roman"/>
+          <w:color w:val="000000"/>
+          <w:sz w:val="24"/>
+          <w:szCs w:val="24"/>
+        </w:rPr>
+        <w:t xml:space="preserve"> Trabajo en equipo</w:t>
+      </w:r>
     </w:p>
     <w:p>
       <w:pPr>
@@ -1173,6 +1162,72 @@
           <w:right w:val="nil"/>
           <w:between w:val="nil"/>
         </w:pBdr>
+        <w:spacing w:before="603" w:line="240" w:lineRule="auto"/>
+        <w:ind w:left="5"/>
+        <w:jc w:val="both"/>
+        <w:rPr>
+          <w:rFonts w:ascii="Times New Roman" w:hAnsi="Times New Roman" w:cs="Times New Roman"/>
+          <w:bCs/>
+          <w:color w:val="000000"/>
+          <w:sz w:val="24"/>
+          <w:szCs w:val="24"/>
+        </w:rPr>
+      </w:pPr>
+      <w:hyperlink r:id="rId7" w:history="1">
+        <w:r>
+          <w:rPr>
+            <w:rStyle w:val="Hipervnculo"/>
+            <w:rFonts w:ascii="Times New Roman" w:hAnsi="Times New Roman" w:cs="Times New Roman"/>
+            <w:bCs/>
+            <w:sz w:val="24"/>
+            <w:szCs w:val="24"/>
+          </w:rPr>
+          <w:t>https://www.infojobs.net/barcelona/desarrollador-full-stack-con-bettatech/of-i38dfdbfb3f49f997084e1a269f4a28?applicationOrigin=search-new&amp;page=1&amp;sortBy=RELEVANCE</w:t>
+        </w:r>
+      </w:hyperlink>
+      <w:r>
+        <w:rPr>
+          <w:rFonts w:ascii="Times New Roman" w:hAnsi="Times New Roman" w:cs="Times New Roman"/>
+          <w:bCs/>
+          <w:color w:val="000000"/>
+          <w:sz w:val="24"/>
+          <w:szCs w:val="24"/>
+        </w:rPr>
+        <w:t xml:space="preserve"> </w:t>
+      </w:r>
+    </w:p>
+    <w:p>
+      <w:pPr>
+        <w:widowControl w:val="0"/>
+        <w:pBdr>
+          <w:top w:val="nil"/>
+          <w:left w:val="nil"/>
+          <w:bottom w:val="nil"/>
+          <w:right w:val="nil"/>
+          <w:between w:val="nil"/>
+        </w:pBdr>
+        <w:spacing w:before="603" w:line="240" w:lineRule="auto"/>
+        <w:ind w:left="5"/>
+        <w:jc w:val="both"/>
+        <w:rPr>
+          <w:rFonts w:ascii="Times New Roman" w:hAnsi="Times New Roman" w:cs="Times New Roman"/>
+          <w:bCs/>
+          <w:color w:val="000000"/>
+          <w:sz w:val="24"/>
+          <w:szCs w:val="24"/>
+        </w:rPr>
+      </w:pPr>
+    </w:p>
+    <w:p>
+      <w:pPr>
+        <w:widowControl w:val="0"/>
+        <w:pBdr>
+          <w:top w:val="nil"/>
+          <w:left w:val="nil"/>
+          <w:bottom w:val="nil"/>
+          <w:right w:val="nil"/>
+          <w:between w:val="nil"/>
+        </w:pBdr>
         <w:spacing w:before="172" w:line="245" w:lineRule="auto"/>
         <w:ind w:left="6" w:right="33" w:firstLine="9"/>
         <w:jc w:val="both"/>
@@ -1183,6 +1238,198 @@
           <w:szCs w:val="24"/>
         </w:rPr>
       </w:pPr>
+      <w:r>
+        <w:rPr>
+          <w:rFonts w:ascii="Times New Roman" w:hAnsi="Times New Roman" w:cs="Times New Roman"/>
+          <w:color w:val="000000"/>
+          <w:sz w:val="24"/>
+          <w:szCs w:val="24"/>
+        </w:rPr>
+        <w:t xml:space="preserve">Nombre de la empresa: </w:t>
+      </w:r>
+      <w:proofErr w:type="spellStart"/>
+      <w:r>
+        <w:rPr>
+          <w:rFonts w:ascii="Times New Roman" w:hAnsi="Times New Roman" w:cs="Times New Roman"/>
+          <w:color w:val="000000"/>
+          <w:sz w:val="24"/>
+          <w:szCs w:val="24"/>
+        </w:rPr>
+        <w:t>Bettatech</w:t>
+      </w:r>
+      <w:proofErr w:type="spellEnd"/>
+    </w:p>
+    <w:p>
+      <w:pPr>
+        <w:widowControl w:val="0"/>
+        <w:pBdr>
+          <w:top w:val="nil"/>
+          <w:left w:val="nil"/>
+          <w:bottom w:val="nil"/>
+          <w:right w:val="nil"/>
+          <w:between w:val="nil"/>
+        </w:pBdr>
+        <w:spacing w:before="172" w:line="245" w:lineRule="auto"/>
+        <w:ind w:left="6" w:right="33" w:firstLine="9"/>
+        <w:jc w:val="both"/>
+        <w:rPr>
+          <w:rFonts w:ascii="Times New Roman" w:hAnsi="Times New Roman" w:cs="Times New Roman"/>
+          <w:b/>
+          <w:bCs/>
+          <w:color w:val="000000"/>
+          <w:sz w:val="24"/>
+          <w:szCs w:val="24"/>
+        </w:rPr>
+      </w:pPr>
+      <w:r>
+        <w:rPr>
+          <w:rFonts w:ascii="Times New Roman" w:hAnsi="Times New Roman" w:cs="Times New Roman"/>
+          <w:color w:val="000000"/>
+          <w:sz w:val="24"/>
+          <w:szCs w:val="24"/>
+        </w:rPr>
+        <w:t xml:space="preserve">Puesto ofertado: </w:t>
+      </w:r>
+      <w:r>
+        <w:rPr>
+          <w:rFonts w:ascii="Times New Roman" w:hAnsi="Times New Roman" w:cs="Times New Roman"/>
+          <w:sz w:val="24"/>
+          <w:szCs w:val="24"/>
+        </w:rPr>
+        <w:t xml:space="preserve">Desarrollador Full </w:t>
+      </w:r>
+      <w:proofErr w:type="spellStart"/>
+      <w:r>
+        <w:rPr>
+          <w:rFonts w:ascii="Times New Roman" w:hAnsi="Times New Roman" w:cs="Times New Roman"/>
+          <w:sz w:val="24"/>
+          <w:szCs w:val="24"/>
+        </w:rPr>
+        <w:t>Stack</w:t>
+      </w:r>
+      <w:proofErr w:type="spellEnd"/>
+    </w:p>
+    <w:p>
+      <w:pPr>
+        <w:widowControl w:val="0"/>
+        <w:pBdr>
+          <w:top w:val="nil"/>
+          <w:left w:val="nil"/>
+          <w:bottom w:val="nil"/>
+          <w:right w:val="nil"/>
+          <w:between w:val="nil"/>
+        </w:pBdr>
+        <w:spacing w:before="172" w:line="245" w:lineRule="auto"/>
+        <w:ind w:right="33"/>
+        <w:jc w:val="both"/>
+        <w:rPr>
+          <w:rFonts w:ascii="Times New Roman" w:hAnsi="Times New Roman" w:cs="Times New Roman"/>
+          <w:color w:val="000000"/>
+          <w:sz w:val="24"/>
+          <w:szCs w:val="24"/>
+        </w:rPr>
+      </w:pPr>
+      <w:r>
+        <w:rPr>
+          <w:rFonts w:ascii="Times New Roman" w:hAnsi="Times New Roman" w:cs="Times New Roman"/>
+          <w:color w:val="000000"/>
+          <w:sz w:val="24"/>
+          <w:szCs w:val="24"/>
+        </w:rPr>
+        <w:t xml:space="preserve">Requisitos técnicos: </w:t>
+      </w:r>
+      <w:r>
+        <w:rPr>
+          <w:rFonts w:ascii="Times New Roman" w:hAnsi="Times New Roman" w:cs="Times New Roman"/>
+          <w:sz w:val="24"/>
+          <w:szCs w:val="24"/>
+        </w:rPr>
+        <w:t>Conocimientos de lenguajes como JavaScript, HTML, CSS</w:t>
+      </w:r>
+    </w:p>
+    <w:p>
+      <w:pPr>
+        <w:widowControl w:val="0"/>
+        <w:pBdr>
+          <w:top w:val="nil"/>
+          <w:left w:val="nil"/>
+          <w:bottom w:val="nil"/>
+          <w:right w:val="nil"/>
+          <w:between w:val="nil"/>
+        </w:pBdr>
+        <w:spacing w:before="172" w:line="245" w:lineRule="auto"/>
+        <w:ind w:right="33"/>
+        <w:jc w:val="both"/>
+        <w:rPr>
+          <w:rFonts w:ascii="Times New Roman" w:hAnsi="Times New Roman" w:cs="Times New Roman"/>
+          <w:color w:val="000000"/>
+          <w:sz w:val="24"/>
+          <w:szCs w:val="24"/>
+        </w:rPr>
+      </w:pPr>
+      <w:r>
+        <w:rPr>
+          <w:rFonts w:ascii="Times New Roman" w:hAnsi="Times New Roman" w:cs="Times New Roman"/>
+          <w:color w:val="000000"/>
+          <w:sz w:val="24"/>
+          <w:szCs w:val="24"/>
+        </w:rPr>
+        <w:t>Competencias personales solicitadas:</w:t>
+      </w:r>
+      <w:r>
+        <w:rPr>
+          <w:rFonts w:ascii="Times New Roman" w:eastAsia="Times New Roman" w:hAnsi="Times New Roman" w:cs="Times New Roman"/>
+          <w:color w:val="595959"/>
+          <w:sz w:val="24"/>
+          <w:szCs w:val="24"/>
+        </w:rPr>
+        <w:t xml:space="preserve"> </w:t>
+      </w:r>
+      <w:r>
+        <w:rPr>
+          <w:rFonts w:ascii="Times New Roman" w:hAnsi="Times New Roman" w:cs="Times New Roman"/>
+          <w:color w:val="000000"/>
+          <w:sz w:val="24"/>
+          <w:szCs w:val="24"/>
+        </w:rPr>
+        <w:t>Capacidad de trabajar en equipo</w:t>
+      </w:r>
+      <w:r>
+        <w:rPr>
+          <w:rFonts w:ascii="Times New Roman" w:hAnsi="Times New Roman" w:cs="Times New Roman"/>
+          <w:color w:val="000000"/>
+          <w:sz w:val="24"/>
+          <w:szCs w:val="24"/>
+        </w:rPr>
+        <w:t>, autonomía y</w:t>
+      </w:r>
+      <w:r>
+        <w:rPr>
+          <w:rFonts w:ascii="Times New Roman" w:hAnsi="Times New Roman" w:cs="Times New Roman"/>
+          <w:color w:val="000000"/>
+          <w:sz w:val="24"/>
+          <w:szCs w:val="24"/>
+        </w:rPr>
+        <w:t xml:space="preserve"> </w:t>
+      </w:r>
+      <w:r>
+        <w:rPr>
+          <w:rFonts w:ascii="Times New Roman" w:hAnsi="Times New Roman" w:cs="Times New Roman"/>
+          <w:color w:val="000000"/>
+          <w:sz w:val="24"/>
+          <w:szCs w:val="24"/>
+        </w:rPr>
+        <w:t>ganas de seguir aprendiendo</w:t>
+      </w:r>
+      <w:r>
+        <w:rPr>
+          <w:rFonts w:ascii="Times New Roman" w:hAnsi="Times New Roman" w:cs="Times New Roman"/>
+          <w:color w:val="000000"/>
+          <w:sz w:val="24"/>
+          <w:szCs w:val="24"/>
+        </w:rPr>
+        <w:t>.</w:t>
+      </w:r>
     </w:p>
     <w:p>
       <w:pPr>
@@ -1195,7 +1442,6 @@
           <w:between w:val="nil"/>
         </w:pBdr>
         <w:spacing w:before="603" w:line="240" w:lineRule="auto"/>
-        <w:ind w:left="5"/>
         <w:jc w:val="both"/>
         <w:rPr>
           <w:rFonts w:ascii="Times New Roman" w:hAnsi="Times New Roman" w:cs="Times New Roman"/>
@@ -1245,17 +1491,15 @@
         </w:rPr>
         <w:t xml:space="preserve">LinkedIn: crea o actualiza tu perfil. Debe incluir foto profesional, estudios, </w:t>
       </w:r>
-      <w:proofErr w:type="gramStart"/>
-      <w:r>
-        <w:rPr>
-          <w:rFonts w:ascii="Times New Roman" w:hAnsi="Times New Roman" w:cs="Times New Roman"/>
-          <w:color w:val="000000"/>
-          <w:sz w:val="24"/>
-          <w:szCs w:val="24"/>
-        </w:rPr>
-        <w:t>experiencia  (</w:t>
-      </w:r>
-      <w:proofErr w:type="gramEnd"/>
+      <w:r>
+        <w:rPr>
+          <w:rFonts w:ascii="Times New Roman" w:hAnsi="Times New Roman" w:cs="Times New Roman"/>
+          <w:color w:val="000000"/>
+          <w:sz w:val="24"/>
+          <w:szCs w:val="24"/>
+        </w:rPr>
+        <w:t>experiencia (</w:t>
+      </w:r>
       <w:r>
         <w:rPr>
           <w:rFonts w:ascii="Times New Roman" w:hAnsi="Times New Roman" w:cs="Times New Roman"/>
@@ -1264,6 +1508,36 @@
           <w:szCs w:val="24"/>
         </w:rPr>
         <w:t xml:space="preserve">aunque sean proyectos del ciclo) y un breve extracto personal. </w:t>
+      </w:r>
+    </w:p>
+    <w:p>
+      <w:pPr>
+        <w:widowControl w:val="0"/>
+        <w:pBdr>
+          <w:top w:val="nil"/>
+          <w:left w:val="nil"/>
+          <w:bottom w:val="nil"/>
+          <w:right w:val="nil"/>
+          <w:between w:val="nil"/>
+        </w:pBdr>
+        <w:spacing w:before="179" w:line="243" w:lineRule="auto"/>
+        <w:ind w:left="13" w:right="143" w:firstLine="2"/>
+        <w:jc w:val="both"/>
+        <w:rPr>
+          <w:rFonts w:ascii="Times New Roman" w:hAnsi="Times New Roman" w:cs="Times New Roman"/>
+          <w:color w:val="000000"/>
+          <w:sz w:val="24"/>
+          <w:szCs w:val="24"/>
+        </w:rPr>
+      </w:pPr>
+      <w:r>
+        <w:rPr>
+          <w:rFonts w:ascii="Segoe UI" w:hAnsi="Segoe UI" w:cs="Segoe UI"/>
+          <w:sz w:val="21"/>
+          <w:szCs w:val="21"/>
+          <w:shd w:val="clear" w:color="auto" w:fill="FFFFFF"/>
+        </w:rPr>
+        <w:t>www.linkedin.com/in/cristina-sandoval-7a8519249</w:t>
       </w:r>
     </w:p>
     <w:p>
@@ -1293,7 +1567,6 @@
           <w:sz w:val="24"/>
           <w:szCs w:val="24"/>
         </w:rPr>
-        <w:lastRenderedPageBreak/>
         <w:t xml:space="preserve">InfoJobs: crea tu perfil con los mismos datos. </w:t>
       </w:r>
     </w:p>
@@ -1326,17 +1599,15 @@
         </w:rPr>
         <w:t xml:space="preserve">Descarga una captura de pantalla o genera un enlace de tu perfil en </w:t>
       </w:r>
-      <w:proofErr w:type="gramStart"/>
-      <w:r>
-        <w:rPr>
-          <w:rFonts w:ascii="Times New Roman" w:hAnsi="Times New Roman" w:cs="Times New Roman"/>
-          <w:color w:val="000000"/>
-          <w:sz w:val="24"/>
-          <w:szCs w:val="24"/>
-        </w:rPr>
-        <w:t>ambas  plataformas</w:t>
-      </w:r>
-      <w:proofErr w:type="gramEnd"/>
+      <w:r>
+        <w:rPr>
+          <w:rFonts w:ascii="Times New Roman" w:hAnsi="Times New Roman" w:cs="Times New Roman"/>
+          <w:color w:val="000000"/>
+          <w:sz w:val="24"/>
+          <w:szCs w:val="24"/>
+        </w:rPr>
+        <w:t>ambas plataformas</w:t>
+      </w:r>
       <w:r>
         <w:rPr>
           <w:rFonts w:ascii="Times New Roman" w:hAnsi="Times New Roman" w:cs="Times New Roman"/>
@@ -1505,7 +1776,16 @@
           <w:sz w:val="24"/>
           <w:szCs w:val="24"/>
         </w:rPr>
-        <w:t xml:space="preserve">Añade tu portfolio si lo tienes. </w:t>
+        <w:t>Añade tu portfolio si lo</w:t>
+      </w:r>
+      <w:r>
+        <w:rPr>
+          <w:rFonts w:ascii="Times New Roman" w:hAnsi="Times New Roman" w:cs="Times New Roman"/>
+          <w:color w:val="000000"/>
+          <w:sz w:val="24"/>
+          <w:szCs w:val="24"/>
+        </w:rPr>
+        <w:t xml:space="preserve"> tienes. </w:t>
       </w:r>
     </w:p>
     <w:p>
@@ -1599,17 +1879,15 @@
         </w:rPr>
         <w:t xml:space="preserve">Redacta una carta de presentación personalizada para esa empresa, explicando </w:t>
       </w:r>
-      <w:proofErr w:type="gramStart"/>
-      <w:r>
-        <w:rPr>
-          <w:rFonts w:ascii="Times New Roman" w:hAnsi="Times New Roman" w:cs="Times New Roman"/>
-          <w:color w:val="000000"/>
-          <w:sz w:val="24"/>
-          <w:szCs w:val="24"/>
-        </w:rPr>
-        <w:t>quién  eres</w:t>
-      </w:r>
-      <w:proofErr w:type="gramEnd"/>
+      <w:r>
+        <w:rPr>
+          <w:rFonts w:ascii="Times New Roman" w:hAnsi="Times New Roman" w:cs="Times New Roman"/>
+          <w:color w:val="000000"/>
+          <w:sz w:val="24"/>
+          <w:szCs w:val="24"/>
+        </w:rPr>
+        <w:t>quién eres</w:t>
+      </w:r>
       <w:r>
         <w:rPr>
           <w:rFonts w:ascii="Times New Roman" w:hAnsi="Times New Roman" w:cs="Times New Roman"/>
@@ -1631,7 +1909,7 @@
 </file>
 
 <file path=word/numbering.xml><?xml version="1.0" encoding="utf-8"?>
-<w:numbering xmlns:wpc="http://schemas.microsoft.com/office/word/2010/wordprocessingCanvas" xmlns:cx="http://schemas.microsoft.com/office/drawing/2014/chartex" xmlns:cx1="http://schemas.microsoft.com/office/drawing/2015/9/8/chartex" xmlns:cx2="http://schemas.microsoft.com/office/drawing/2015/10/21/chartex" xmlns:cx3="http://schemas.microsoft.com/office/drawing/2016/5/9/chartex" xmlns:cx4="http://schemas.microsoft.com/office/drawing/2016/5/10/chartex" xmlns:cx5="http://schemas.microsoft.com/office/drawing/2016/5/11/chartex" xmlns:cx6="http://schemas.microsoft.com/office/drawing/2016/5/12/chartex" xmlns:cx7="http://schemas.microsoft.com/office/drawing/2016/5/13/chartex" xmlns:cx8="http://schemas.microsoft.com/office/drawing/2016/5/14/chartex" xmlns:mc="http://schemas.openxmlformats.org/markup-compatibility/2006" xmlns:aink="http://schemas.microsoft.com/office/drawing/2016/ink" xmlns:am3d="http://schemas.microsoft.com/office/drawing/2017/model3d" xmlns:o="urn:schemas-microsoft-com:office:office" xmlns:oel="http://schemas.microsoft.com/office/2019/extlst" xmlns:r="http://schemas.openxmlformats.org/officeDocument/2006/relationships" xmlns:m="http://schemas.openxmlformats.org/officeDocument/2006/math" xmlns:v="urn:schemas-microsoft-com:vml" xmlns:wp14="http://schemas.microsoft.com/office/word/2010/wordprocessingDrawing" xmlns:wp="http://schemas.openxmlformats.org/drawingml/2006/wordprocessingDrawing" xmlns:w10="urn:schemas-microsoft-com:office:word" xmlns:w="http://schemas.openxmlformats.org/wordprocessingml/2006/main" xmlns:w14="http://schemas.microsoft.com/office/word/2010/wordml" xmlns:w15="http://schemas.microsoft.com/office/word/2012/wordml" xmlns:w16cex="http://schemas.microsoft.com/office/word/2018/wordml/cex" xmlns:w16cid="http://schemas.microsoft.com/office/word/2016/wordml/cid" xmlns:w16="http://schemas.microsoft.com/office/word/2018/wordml" xmlns:w16du="http://schemas.microsoft.com/office/word/2023/wordml/word16du" xmlns:w16sdtdh="http://schemas.microsoft.com/office/word/2020/wordml/sdtdatahash" xmlns:w16sdtfl="http://schemas.microsoft.com/office/word/2024/wordml/sdtformatlock" xmlns:w16se="http://schemas.microsoft.com/office/word/2015/wordml/symex" xmlns:wpg="http://schemas.microsoft.com/office/word/2010/wordprocessingGroup" xmlns:wpi="http://schemas.microsoft.com/office/word/2010/wordprocessingInk" xmlns:wne="http://schemas.microsoft.com/office/word/2006/wordml" xmlns:wps="http://schemas.microsoft.com/office/word/2010/wordprocessingShape" mc:Ignorable="w14 w15 w16se w16cid w16 w16cex w16sdtdh w16sdtfl w16du wp14">
+<w:numbering xmlns:wpc="http://schemas.microsoft.com/office/word/2010/wordprocessingCanvas" xmlns:cx="http://schemas.microsoft.com/office/drawing/2014/chartex" xmlns:cx1="http://schemas.microsoft.com/office/drawing/2015/9/8/chartex" xmlns:cx2="http://schemas.microsoft.com/office/drawing/2015/10/21/chartex" xmlns:cx3="http://schemas.microsoft.com/office/drawing/2016/5/9/chartex" xmlns:cx4="http://schemas.microsoft.com/office/drawing/2016/5/10/chartex" xmlns:cx5="http://schemas.microsoft.com/office/drawing/2016/5/11/chartex" xmlns:cx6="http://schemas.microsoft.com/office/drawing/2016/5/12/chartex" xmlns:cx7="http://schemas.microsoft.com/office/drawing/2016/5/13/chartex" xmlns:cx8="http://schemas.microsoft.com/office/drawing/2016/5/14/chartex" xmlns:mc="http://schemas.openxmlformats.org/markup-compatibility/2006" xmlns:aink="http://schemas.microsoft.com/office/drawing/2016/ink" xmlns:am3d="http://schemas.microsoft.com/office/drawing/2017/model3d" xmlns:o="urn:schemas-microsoft-com:office:office" xmlns:r="http://schemas.openxmlformats.org/officeDocument/2006/relationships" xmlns:m="http://schemas.openxmlformats.org/officeDocument/2006/math" xmlns:v="urn:schemas-microsoft-com:vml" xmlns:wp14="http://schemas.microsoft.com/office/word/2010/wordprocessingDrawing" xmlns:wp="http://schemas.openxmlformats.org/drawingml/2006/wordprocessingDrawing" xmlns:w10="urn:schemas-microsoft-com:office:word" xmlns:w="http://schemas.openxmlformats.org/wordprocessingml/2006/main" xmlns:w14="http://schemas.microsoft.com/office/word/2010/wordml" xmlns:w15="http://schemas.microsoft.com/office/word/2012/wordml" xmlns:w16cex="http://schemas.microsoft.com/office/word/2018/wordml/cex" xmlns:w16cid="http://schemas.microsoft.com/office/word/2016/wordml/cid" xmlns:w16="http://schemas.microsoft.com/office/word/2018/wordml" xmlns:w16sdtdh="http://schemas.microsoft.com/office/word/2020/wordml/sdtdatahash" xmlns:w16se="http://schemas.microsoft.com/office/word/2015/wordml/symex" xmlns:wpg="http://schemas.microsoft.com/office/word/2010/wordprocessingGroup" xmlns:wpi="http://schemas.microsoft.com/office/word/2010/wordprocessingInk" xmlns:wne="http://schemas.microsoft.com/office/word/2006/wordml" xmlns:wps="http://schemas.microsoft.com/office/word/2010/wordprocessingShape" mc:Ignorable="w14 w15 w16se w16cid w16 w16cex w16sdtdh wp14">
   <w:abstractNum w:abstractNumId="0" w15:restartNumberingAfterBreak="0">
     <w:nsid w:val="072A03B8"/>
     <w:multiLevelType w:val="multilevel"/>
@@ -1930,17 +2208,17 @@
       </w:rPr>
     </w:lvl>
   </w:abstractNum>
-  <w:num w:numId="1" w16cid:durableId="151219478">
+  <w:num w:numId="1">
     <w:abstractNumId w:val="0"/>
   </w:num>
-  <w:num w:numId="2" w16cid:durableId="1891264754">
+  <w:num w:numId="2">
     <w:abstractNumId w:val="1"/>
   </w:num>
 </w:numbering>
 </file>
 
 <file path=word/styles.xml><?xml version="1.0" encoding="utf-8"?>
-<w:styles xmlns:mc="http://schemas.openxmlformats.org/markup-compatibility/2006" xmlns:r="http://schemas.openxmlformats.org/officeDocument/2006/relationships" xmlns:w="http://schemas.openxmlformats.org/wordprocessingml/2006/main" xmlns:w14="http://schemas.microsoft.com/office/word/2010/wordml" xmlns:w15="http://schemas.microsoft.com/office/word/2012/wordml" xmlns:w16cex="http://schemas.microsoft.com/office/word/2018/wordml/cex" xmlns:w16cid="http://schemas.microsoft.com/office/word/2016/wordml/cid" xmlns:w16="http://schemas.microsoft.com/office/word/2018/wordml" xmlns:w16du="http://schemas.microsoft.com/office/word/2023/wordml/word16du" xmlns:w16sdtdh="http://schemas.microsoft.com/office/word/2020/wordml/sdtdatahash" xmlns:w16sdtfl="http://schemas.microsoft.com/office/word/2024/wordml/sdtformatlock" xmlns:w16se="http://schemas.microsoft.com/office/word/2015/wordml/symex" mc:Ignorable="w14 w15 w16se w16cid w16 w16cex w16sdtdh w16sdtfl w16du">
+<w:styles xmlns:mc="http://schemas.openxmlformats.org/markup-compatibility/2006" xmlns:r="http://schemas.openxmlformats.org/officeDocument/2006/relationships" xmlns:w="http://schemas.openxmlformats.org/wordprocessingml/2006/main" xmlns:w14="http://schemas.microsoft.com/office/word/2010/wordml" xmlns:w15="http://schemas.microsoft.com/office/word/2012/wordml" xmlns:w16cex="http://schemas.microsoft.com/office/word/2018/wordml/cex" xmlns:w16cid="http://schemas.microsoft.com/office/word/2016/wordml/cid" xmlns:w16="http://schemas.microsoft.com/office/word/2018/wordml" xmlns:w16sdtdh="http://schemas.microsoft.com/office/word/2020/wordml/sdtdatahash" xmlns:w16se="http://schemas.microsoft.com/office/word/2015/wordml/symex" mc:Ignorable="w14 w15 w16se w16cid w16 w16cex w16sdtdh">
   <w:docDefaults>
     <w:rPrDefault>
       <w:rPr>
@@ -2457,6 +2735,7 @@
   <w:style w:type="character" w:default="1" w:styleId="Fuentedeprrafopredeter">
     <w:name w:val="Default Paragraph Font"/>
     <w:uiPriority w:val="1"/>
+    <w:semiHidden/>
     <w:unhideWhenUsed/>
   </w:style>
   <w:style w:type="table" w:default="1" w:styleId="Tablanormal">

</xml_diff>